<commit_message>
Test plan, test case document and featurelisting uploaded
</commit_message>
<xml_diff>
--- a/Test Plan – AcademyBugs Website.docx
+++ b/Test Plan – AcademyBugs Website.docx
@@ -1211,30 +1211,6 @@
           <w:szCs w:val="28"/>
           <w:rtl w:val="0"/>
         </w:rPr>
-        <w:t xml:space="preserve">Integration Testing</w:t>
-      </w:r>
-    </w:p>
-    <w:p>
-      <w:pPr>
-        <w:numPr>
-          <w:ilvl w:val="2"/>
-          <w:numId w:val="1"/>
-        </w:numPr>
-        <w:spacing w:line="360" w:lineRule="auto"/>
-        <w:ind w:left="2160" w:hanging="360"/>
-        <w:rPr>
-          <w:rFonts w:ascii="Times New Roman" w:cs="Times New Roman" w:eastAsia="Times New Roman" w:hAnsi="Times New Roman"/>
-          <w:sz w:val="28"/>
-          <w:szCs w:val="28"/>
-        </w:rPr>
-      </w:pPr>
-      <w:r>
-        <w:rPr>
-          <w:rFonts w:ascii="Times New Roman" w:cs="Times New Roman" w:eastAsia="Times New Roman" w:hAnsi="Times New Roman"/>
-          <w:sz w:val="28"/>
-          <w:szCs w:val="28"/>
-          <w:rtl w:val="0"/>
-        </w:rPr>
         <w:t xml:space="preserve">Regression Testing</w:t>
       </w:r>
     </w:p>
@@ -1665,11 +1641,6 @@
         </w:rPr>
         <w:t xml:space="preserve"> Chrome, Firefox, Edge</w:t>
       </w:r>
-      <w:r>
-        <w:rPr>
-          <w:rtl w:val="0"/>
-        </w:rPr>
-      </w:r>
     </w:p>
     <w:p>
       <w:pPr>
@@ -1703,7 +1674,7 @@
           <w:szCs w:val="28"/>
           <w:rtl w:val="0"/>
         </w:rPr>
-        <w:t xml:space="preserve"> Windows 11</w:t>
+        <w:t xml:space="preserve"> Windows 11, Android</w:t>
       </w:r>
     </w:p>
     <w:p>
@@ -1878,7 +1849,7 @@
           <w:szCs w:val="28"/>
           <w:rtl w:val="0"/>
         </w:rPr>
-        <w:t xml:space="preserve">: TestNG</w:t>
+        <w:t xml:space="preserve">: TestNG, POM, Maven</w:t>
       </w:r>
     </w:p>
     <w:p>
@@ -3114,23 +3085,1260 @@
           <w:b w:val="1"/>
           <w:bCs w:val="1"/>
           <w:color w:val="0f1115"/>
-          <w:sz w:val="28"/>
-          <w:szCs w:val="28"/>
-        </w:rPr>
-      </w:pPr>
-      <w:r>
-        <w:rPr>
-          <w:rFonts w:ascii="Times New Roman" w:cs="Times New Roman" w:eastAsia="Times New Roman" w:hAnsi="Times New Roman"/>
-          <w:b w:val="1"/>
-          <w:bCs w:val="1"/>
-          <w:color w:val="0f1115"/>
           <w:sz w:val="32"/>
           <w:szCs w:val="32"/>
-          <w:rtl w:val="0"/>
-        </w:rPr>
-        <w:t xml:space="preserve"> Conclusion</w:t>
-      </w:r>
-    </w:p>
+        </w:rPr>
+      </w:pPr>
+      <w:r>
+        <w:rPr>
+          <w:rFonts w:ascii="Times New Roman" w:cs="Times New Roman" w:eastAsia="Times New Roman" w:hAnsi="Times New Roman"/>
+          <w:b w:val="1"/>
+          <w:bCs w:val="1"/>
+          <w:color w:val="0f1115"/>
+          <w:sz w:val="32"/>
+          <w:szCs w:val="32"/>
+          <w:rtl w:val="0"/>
+        </w:rPr>
+        <w:t xml:space="preserve">Test schedule</w:t>
+      </w:r>
+      <w:r>
+        <w:rPr>
+          <w:rtl w:val="0"/>
+        </w:rPr>
+      </w:r>
+    </w:p>
+    <w:tbl>
+      <w:tblPr>
+        <w:tblStyle w:val="Table1"/>
+        <w:tblW w:w="7245.0" w:type="dxa"/>
+        <w:jc w:val="left"/>
+        <w:tblInd w:w="705.0" w:type="dxa"/>
+        <w:tblBorders>
+          <w:top w:color="000000" w:space="0" w:sz="4" w:val="single"/>
+          <w:left w:color="000000" w:space="0" w:sz="4" w:val="single"/>
+          <w:bottom w:color="000000" w:space="0" w:sz="4" w:val="single"/>
+          <w:right w:color="000000" w:space="0" w:sz="4" w:val="single"/>
+          <w:insideH w:color="000000" w:space="0" w:sz="4" w:val="single"/>
+          <w:insideV w:color="000000" w:space="0" w:sz="4" w:val="single"/>
+        </w:tblBorders>
+        <w:tblLayout w:type="fixed"/>
+        <w:tblLook w:val="0600"/>
+      </w:tblPr>
+      <w:tblGrid>
+        <w:gridCol w:w="1905"/>
+        <w:gridCol w:w="1815"/>
+        <w:gridCol w:w="1680"/>
+        <w:gridCol w:w="1845"/>
+        <w:tblGridChange w:id="0">
+          <w:tblGrid>
+            <w:gridCol w:w="1905"/>
+            <w:gridCol w:w="1815"/>
+            <w:gridCol w:w="1680"/>
+            <w:gridCol w:w="1845"/>
+          </w:tblGrid>
+        </w:tblGridChange>
+      </w:tblGrid>
+      <w:tr>
+        <w:trPr>
+          <w:cantSplit w:val="0"/>
+          <w:trHeight w:val="852.9589843749999" w:hRule="atLeast"/>
+          <w:tblHeader w:val="0"/>
+        </w:trPr>
+        <w:tc>
+          <w:tcPr>
+            <w:tcBorders>
+              <w:top w:color="000000" w:space="0" w:sz="4" w:val="single"/>
+              <w:left w:color="000000" w:space="0" w:sz="4" w:val="single"/>
+              <w:bottom w:color="000000" w:space="0" w:sz="4" w:val="single"/>
+              <w:right w:color="000000" w:space="0" w:sz="4" w:val="single"/>
+            </w:tcBorders>
+            <w:tcMar>
+              <w:top w:w="100.0" w:type="dxa"/>
+              <w:left w:w="100.0" w:type="dxa"/>
+              <w:bottom w:w="100.0" w:type="dxa"/>
+              <w:right w:w="100.0" w:type="dxa"/>
+            </w:tcMar>
+            <w:vAlign w:val="top"/>
+          </w:tcPr>
+          <w:p>
+            <w:pPr>
+              <w:shd w:fill="ffffff" w:val="clear"/>
+              <w:spacing w:after="240" w:before="340" w:line="360" w:lineRule="auto"/>
+              <w:ind w:left="0" w:firstLine="0"/>
+              <w:rPr>
+                <w:rFonts w:ascii="Times New Roman" w:cs="Times New Roman" w:eastAsia="Times New Roman" w:hAnsi="Times New Roman"/>
+                <w:color w:val="0f1115"/>
+                <w:sz w:val="28"/>
+                <w:szCs w:val="28"/>
+              </w:rPr>
+            </w:pPr>
+            <w:r>
+              <w:rPr>
+                <w:rFonts w:ascii="Times New Roman" w:cs="Times New Roman" w:eastAsia="Times New Roman" w:hAnsi="Times New Roman"/>
+                <w:b w:val="1"/>
+                <w:bCs w:val="1"/>
+                <w:color w:val="0f1115"/>
+                <w:sz w:val="28"/>
+                <w:szCs w:val="28"/>
+                <w:rtl w:val="0"/>
+              </w:rPr>
+              <w:t xml:space="preserve">Activity</w:t>
+            </w:r>
+            <w:r>
+              <w:rPr>
+                <w:rtl w:val="0"/>
+              </w:rPr>
+            </w:r>
+          </w:p>
+        </w:tc>
+        <w:tc>
+          <w:tcPr>
+            <w:tcBorders>
+              <w:top w:color="000000" w:space="0" w:sz="4" w:val="single"/>
+              <w:left w:color="000000" w:space="0" w:sz="4" w:val="single"/>
+              <w:bottom w:color="000000" w:space="0" w:sz="4" w:val="single"/>
+              <w:right w:color="000000" w:space="0" w:sz="4" w:val="single"/>
+            </w:tcBorders>
+            <w:tcMar>
+              <w:top w:w="100.0" w:type="dxa"/>
+              <w:left w:w="100.0" w:type="dxa"/>
+              <w:bottom w:w="100.0" w:type="dxa"/>
+              <w:right w:w="100.0" w:type="dxa"/>
+            </w:tcMar>
+            <w:vAlign w:val="top"/>
+          </w:tcPr>
+          <w:p>
+            <w:pPr>
+              <w:shd w:fill="ffffff" w:val="clear"/>
+              <w:spacing w:after="240" w:before="340" w:line="360" w:lineRule="auto"/>
+              <w:ind w:left="0" w:firstLine="0"/>
+              <w:rPr>
+                <w:rFonts w:ascii="Times New Roman" w:cs="Times New Roman" w:eastAsia="Times New Roman" w:hAnsi="Times New Roman"/>
+                <w:b w:val="1"/>
+                <w:bCs w:val="1"/>
+                <w:color w:val="0f1115"/>
+                <w:sz w:val="28"/>
+                <w:szCs w:val="28"/>
+              </w:rPr>
+            </w:pPr>
+            <w:r>
+              <w:rPr>
+                <w:rFonts w:ascii="Times New Roman" w:cs="Times New Roman" w:eastAsia="Times New Roman" w:hAnsi="Times New Roman"/>
+                <w:b w:val="1"/>
+                <w:bCs w:val="1"/>
+                <w:color w:val="0f1115"/>
+                <w:sz w:val="28"/>
+                <w:szCs w:val="28"/>
+                <w:rtl w:val="0"/>
+              </w:rPr>
+              <w:t xml:space="preserve">No.  of days</w:t>
+            </w:r>
+          </w:p>
+        </w:tc>
+        <w:tc>
+          <w:tcPr>
+            <w:tcBorders>
+              <w:top w:color="000000" w:space="0" w:sz="4" w:val="single"/>
+              <w:left w:color="000000" w:space="0" w:sz="4" w:val="single"/>
+              <w:bottom w:color="000000" w:space="0" w:sz="4" w:val="single"/>
+              <w:right w:color="000000" w:space="0" w:sz="4" w:val="single"/>
+            </w:tcBorders>
+            <w:tcMar>
+              <w:top w:w="100.0" w:type="dxa"/>
+              <w:left w:w="100.0" w:type="dxa"/>
+              <w:bottom w:w="100.0" w:type="dxa"/>
+              <w:right w:w="100.0" w:type="dxa"/>
+            </w:tcMar>
+            <w:vAlign w:val="top"/>
+          </w:tcPr>
+          <w:p>
+            <w:pPr>
+              <w:shd w:fill="ffffff" w:val="clear"/>
+              <w:spacing w:after="240" w:before="340" w:line="360" w:lineRule="auto"/>
+              <w:ind w:left="0" w:firstLine="0"/>
+              <w:rPr>
+                <w:rFonts w:ascii="Times New Roman" w:cs="Times New Roman" w:eastAsia="Times New Roman" w:hAnsi="Times New Roman"/>
+                <w:color w:val="0f1115"/>
+                <w:sz w:val="28"/>
+                <w:szCs w:val="28"/>
+              </w:rPr>
+            </w:pPr>
+            <w:r>
+              <w:rPr>
+                <w:rFonts w:ascii="Times New Roman" w:cs="Times New Roman" w:eastAsia="Times New Roman" w:hAnsi="Times New Roman"/>
+                <w:b w:val="1"/>
+                <w:bCs w:val="1"/>
+                <w:color w:val="0f1115"/>
+                <w:sz w:val="28"/>
+                <w:szCs w:val="28"/>
+                <w:rtl w:val="0"/>
+              </w:rPr>
+              <w:t xml:space="preserve">Start Date</w:t>
+            </w:r>
+            <w:r>
+              <w:rPr>
+                <w:rtl w:val="0"/>
+              </w:rPr>
+            </w:r>
+          </w:p>
+        </w:tc>
+        <w:tc>
+          <w:tcPr>
+            <w:tcBorders>
+              <w:top w:color="000000" w:space="0" w:sz="4" w:val="single"/>
+              <w:left w:color="000000" w:space="0" w:sz="4" w:val="single"/>
+              <w:bottom w:color="000000" w:space="0" w:sz="4" w:val="single"/>
+              <w:right w:color="000000" w:space="0" w:sz="4" w:val="single"/>
+            </w:tcBorders>
+            <w:tcMar>
+              <w:top w:w="100.0" w:type="dxa"/>
+              <w:left w:w="100.0" w:type="dxa"/>
+              <w:bottom w:w="100.0" w:type="dxa"/>
+              <w:right w:w="100.0" w:type="dxa"/>
+            </w:tcMar>
+            <w:vAlign w:val="top"/>
+          </w:tcPr>
+          <w:p>
+            <w:pPr>
+              <w:shd w:fill="ffffff" w:val="clear"/>
+              <w:spacing w:after="240" w:before="340" w:line="360" w:lineRule="auto"/>
+              <w:ind w:left="0" w:firstLine="0"/>
+              <w:rPr>
+                <w:rFonts w:ascii="Times New Roman" w:cs="Times New Roman" w:eastAsia="Times New Roman" w:hAnsi="Times New Roman"/>
+                <w:color w:val="0f1115"/>
+                <w:sz w:val="28"/>
+                <w:szCs w:val="28"/>
+              </w:rPr>
+            </w:pPr>
+            <w:r>
+              <w:rPr>
+                <w:rFonts w:ascii="Times New Roman" w:cs="Times New Roman" w:eastAsia="Times New Roman" w:hAnsi="Times New Roman"/>
+                <w:b w:val="1"/>
+                <w:bCs w:val="1"/>
+                <w:color w:val="0f1115"/>
+                <w:sz w:val="28"/>
+                <w:szCs w:val="28"/>
+                <w:rtl w:val="0"/>
+              </w:rPr>
+              <w:t xml:space="preserve">End Date</w:t>
+            </w:r>
+            <w:r>
+              <w:rPr>
+                <w:rtl w:val="0"/>
+              </w:rPr>
+            </w:r>
+          </w:p>
+        </w:tc>
+      </w:tr>
+      <w:tr>
+        <w:trPr>
+          <w:cantSplit w:val="0"/>
+          <w:trHeight w:val="822.9589843749999" w:hRule="atLeast"/>
+          <w:tblHeader w:val="0"/>
+        </w:trPr>
+        <w:tc>
+          <w:tcPr>
+            <w:tcBorders>
+              <w:top w:color="000000" w:space="0" w:sz="4" w:val="single"/>
+              <w:left w:color="000000" w:space="0" w:sz="4" w:val="single"/>
+              <w:bottom w:color="000000" w:space="0" w:sz="4" w:val="single"/>
+              <w:right w:color="000000" w:space="0" w:sz="4" w:val="single"/>
+            </w:tcBorders>
+            <w:tcMar>
+              <w:top w:w="100.0" w:type="dxa"/>
+              <w:left w:w="100.0" w:type="dxa"/>
+              <w:bottom w:w="100.0" w:type="dxa"/>
+              <w:right w:w="100.0" w:type="dxa"/>
+            </w:tcMar>
+            <w:vAlign w:val="top"/>
+          </w:tcPr>
+          <w:p>
+            <w:pPr>
+              <w:shd w:fill="ffffff" w:val="clear"/>
+              <w:spacing w:after="240" w:before="340" w:line="360" w:lineRule="auto"/>
+              <w:ind w:left="0" w:firstLine="0"/>
+              <w:rPr>
+                <w:rFonts w:ascii="Times New Roman" w:cs="Times New Roman" w:eastAsia="Times New Roman" w:hAnsi="Times New Roman"/>
+                <w:color w:val="0f1115"/>
+                <w:sz w:val="28"/>
+                <w:szCs w:val="28"/>
+              </w:rPr>
+            </w:pPr>
+            <w:r>
+              <w:rPr>
+                <w:rFonts w:ascii="Times New Roman" w:cs="Times New Roman" w:eastAsia="Times New Roman" w:hAnsi="Times New Roman"/>
+                <w:color w:val="0f1115"/>
+                <w:sz w:val="28"/>
+                <w:szCs w:val="28"/>
+                <w:rtl w:val="0"/>
+              </w:rPr>
+              <w:t xml:space="preserve">Feature listing</w:t>
+            </w:r>
+          </w:p>
+        </w:tc>
+        <w:tc>
+          <w:tcPr>
+            <w:tcBorders>
+              <w:top w:color="000000" w:space="0" w:sz="4" w:val="single"/>
+              <w:left w:color="000000" w:space="0" w:sz="4" w:val="single"/>
+              <w:bottom w:color="000000" w:space="0" w:sz="4" w:val="single"/>
+              <w:right w:color="000000" w:space="0" w:sz="4" w:val="single"/>
+            </w:tcBorders>
+            <w:tcMar>
+              <w:top w:w="100.0" w:type="dxa"/>
+              <w:left w:w="100.0" w:type="dxa"/>
+              <w:bottom w:w="100.0" w:type="dxa"/>
+              <w:right w:w="100.0" w:type="dxa"/>
+            </w:tcMar>
+            <w:vAlign w:val="top"/>
+          </w:tcPr>
+          <w:p>
+            <w:pPr>
+              <w:shd w:fill="ffffff" w:val="clear"/>
+              <w:spacing w:after="240" w:before="340" w:line="360" w:lineRule="auto"/>
+              <w:ind w:left="0" w:firstLine="0"/>
+              <w:jc w:val="center"/>
+              <w:rPr>
+                <w:rFonts w:ascii="Times New Roman" w:cs="Times New Roman" w:eastAsia="Times New Roman" w:hAnsi="Times New Roman"/>
+                <w:color w:val="0f1115"/>
+                <w:sz w:val="28"/>
+                <w:szCs w:val="28"/>
+              </w:rPr>
+            </w:pPr>
+            <w:r>
+              <w:rPr>
+                <w:rFonts w:ascii="Times New Roman" w:cs="Times New Roman" w:eastAsia="Times New Roman" w:hAnsi="Times New Roman"/>
+                <w:color w:val="0f1115"/>
+                <w:sz w:val="28"/>
+                <w:szCs w:val="28"/>
+                <w:rtl w:val="0"/>
+              </w:rPr>
+              <w:t xml:space="preserve">1</w:t>
+            </w:r>
+          </w:p>
+        </w:tc>
+        <w:tc>
+          <w:tcPr>
+            <w:tcBorders>
+              <w:top w:color="000000" w:space="0" w:sz="4" w:val="single"/>
+              <w:left w:color="000000" w:space="0" w:sz="4" w:val="single"/>
+              <w:bottom w:color="000000" w:space="0" w:sz="4" w:val="single"/>
+              <w:right w:color="000000" w:space="0" w:sz="4" w:val="single"/>
+            </w:tcBorders>
+            <w:tcMar>
+              <w:top w:w="100.0" w:type="dxa"/>
+              <w:left w:w="100.0" w:type="dxa"/>
+              <w:bottom w:w="100.0" w:type="dxa"/>
+              <w:right w:w="100.0" w:type="dxa"/>
+            </w:tcMar>
+            <w:vAlign w:val="top"/>
+          </w:tcPr>
+          <w:p>
+            <w:pPr>
+              <w:shd w:fill="ffffff" w:val="clear"/>
+              <w:spacing w:after="240" w:before="340" w:line="360" w:lineRule="auto"/>
+              <w:ind w:left="0" w:firstLine="0"/>
+              <w:rPr>
+                <w:rFonts w:ascii="Times New Roman" w:cs="Times New Roman" w:eastAsia="Times New Roman" w:hAnsi="Times New Roman"/>
+                <w:color w:val="0f1115"/>
+                <w:sz w:val="28"/>
+                <w:szCs w:val="28"/>
+              </w:rPr>
+            </w:pPr>
+            <w:r>
+              <w:rPr>
+                <w:rFonts w:ascii="Times New Roman" w:cs="Times New Roman" w:eastAsia="Times New Roman" w:hAnsi="Times New Roman"/>
+                <w:color w:val="0f1115"/>
+                <w:sz w:val="28"/>
+                <w:szCs w:val="28"/>
+                <w:rtl w:val="0"/>
+              </w:rPr>
+              <w:t xml:space="preserve">03-12-2025</w:t>
+            </w:r>
+          </w:p>
+        </w:tc>
+        <w:tc>
+          <w:tcPr>
+            <w:tcBorders>
+              <w:top w:color="000000" w:space="0" w:sz="4" w:val="single"/>
+              <w:left w:color="000000" w:space="0" w:sz="4" w:val="single"/>
+              <w:bottom w:color="000000" w:space="0" w:sz="4" w:val="single"/>
+              <w:right w:color="000000" w:space="0" w:sz="4" w:val="single"/>
+            </w:tcBorders>
+            <w:tcMar>
+              <w:top w:w="100.0" w:type="dxa"/>
+              <w:left w:w="100.0" w:type="dxa"/>
+              <w:bottom w:w="100.0" w:type="dxa"/>
+              <w:right w:w="100.0" w:type="dxa"/>
+            </w:tcMar>
+            <w:vAlign w:val="top"/>
+          </w:tcPr>
+          <w:p>
+            <w:pPr>
+              <w:shd w:fill="ffffff" w:val="clear"/>
+              <w:spacing w:after="240" w:before="340" w:line="360" w:lineRule="auto"/>
+              <w:ind w:left="0" w:firstLine="0"/>
+              <w:rPr>
+                <w:rFonts w:ascii="Times New Roman" w:cs="Times New Roman" w:eastAsia="Times New Roman" w:hAnsi="Times New Roman"/>
+                <w:color w:val="0f1115"/>
+                <w:sz w:val="28"/>
+                <w:szCs w:val="28"/>
+              </w:rPr>
+            </w:pPr>
+            <w:r>
+              <w:rPr>
+                <w:rFonts w:ascii="Times New Roman" w:cs="Times New Roman" w:eastAsia="Times New Roman" w:hAnsi="Times New Roman"/>
+                <w:color w:val="0f1115"/>
+                <w:sz w:val="28"/>
+                <w:szCs w:val="28"/>
+                <w:rtl w:val="0"/>
+              </w:rPr>
+              <w:t xml:space="preserve">03-12-2025</w:t>
+            </w:r>
+          </w:p>
+        </w:tc>
+      </w:tr>
+      <w:tr>
+        <w:trPr>
+          <w:cantSplit w:val="0"/>
+          <w:trHeight w:val="762.9589843749999" w:hRule="atLeast"/>
+          <w:tblHeader w:val="0"/>
+        </w:trPr>
+        <w:tc>
+          <w:tcPr>
+            <w:tcBorders>
+              <w:top w:color="000000" w:space="0" w:sz="4" w:val="single"/>
+              <w:left w:color="000000" w:space="0" w:sz="4" w:val="single"/>
+              <w:bottom w:color="000000" w:space="0" w:sz="4" w:val="single"/>
+              <w:right w:color="000000" w:space="0" w:sz="4" w:val="single"/>
+            </w:tcBorders>
+            <w:tcMar>
+              <w:top w:w="100.0" w:type="dxa"/>
+              <w:left w:w="100.0" w:type="dxa"/>
+              <w:bottom w:w="100.0" w:type="dxa"/>
+              <w:right w:w="100.0" w:type="dxa"/>
+            </w:tcMar>
+            <w:vAlign w:val="top"/>
+          </w:tcPr>
+          <w:p>
+            <w:pPr>
+              <w:shd w:fill="ffffff" w:val="clear"/>
+              <w:spacing w:after="240" w:before="340" w:line="360" w:lineRule="auto"/>
+              <w:ind w:left="0" w:firstLine="0"/>
+              <w:rPr>
+                <w:rFonts w:ascii="Times New Roman" w:cs="Times New Roman" w:eastAsia="Times New Roman" w:hAnsi="Times New Roman"/>
+                <w:color w:val="0f1115"/>
+                <w:sz w:val="28"/>
+                <w:szCs w:val="28"/>
+              </w:rPr>
+            </w:pPr>
+            <w:r>
+              <w:rPr>
+                <w:rFonts w:ascii="Times New Roman" w:cs="Times New Roman" w:eastAsia="Times New Roman" w:hAnsi="Times New Roman"/>
+                <w:color w:val="0f1115"/>
+                <w:sz w:val="28"/>
+                <w:szCs w:val="28"/>
+                <w:rtl w:val="0"/>
+              </w:rPr>
+              <w:t xml:space="preserve">Test Plan</w:t>
+            </w:r>
+          </w:p>
+        </w:tc>
+        <w:tc>
+          <w:tcPr>
+            <w:tcBorders>
+              <w:top w:color="000000" w:space="0" w:sz="4" w:val="single"/>
+              <w:left w:color="000000" w:space="0" w:sz="4" w:val="single"/>
+              <w:bottom w:color="000000" w:space="0" w:sz="4" w:val="single"/>
+              <w:right w:color="000000" w:space="0" w:sz="4" w:val="single"/>
+            </w:tcBorders>
+            <w:tcMar>
+              <w:top w:w="100.0" w:type="dxa"/>
+              <w:left w:w="100.0" w:type="dxa"/>
+              <w:bottom w:w="100.0" w:type="dxa"/>
+              <w:right w:w="100.0" w:type="dxa"/>
+            </w:tcMar>
+            <w:vAlign w:val="top"/>
+          </w:tcPr>
+          <w:p>
+            <w:pPr>
+              <w:shd w:fill="ffffff" w:val="clear"/>
+              <w:spacing w:after="240" w:before="340" w:line="360" w:lineRule="auto"/>
+              <w:ind w:left="0" w:firstLine="0"/>
+              <w:jc w:val="center"/>
+              <w:rPr>
+                <w:rFonts w:ascii="Times New Roman" w:cs="Times New Roman" w:eastAsia="Times New Roman" w:hAnsi="Times New Roman"/>
+                <w:color w:val="0f1115"/>
+                <w:sz w:val="28"/>
+                <w:szCs w:val="28"/>
+              </w:rPr>
+            </w:pPr>
+            <w:r>
+              <w:rPr>
+                <w:rFonts w:ascii="Times New Roman" w:cs="Times New Roman" w:eastAsia="Times New Roman" w:hAnsi="Times New Roman"/>
+                <w:color w:val="0f1115"/>
+                <w:sz w:val="28"/>
+                <w:szCs w:val="28"/>
+                <w:rtl w:val="0"/>
+              </w:rPr>
+              <w:t xml:space="preserve">2</w:t>
+            </w:r>
+          </w:p>
+        </w:tc>
+        <w:tc>
+          <w:tcPr>
+            <w:tcBorders>
+              <w:top w:color="000000" w:space="0" w:sz="4" w:val="single"/>
+              <w:left w:color="000000" w:space="0" w:sz="4" w:val="single"/>
+              <w:bottom w:color="000000" w:space="0" w:sz="4" w:val="single"/>
+              <w:right w:color="000000" w:space="0" w:sz="4" w:val="single"/>
+            </w:tcBorders>
+            <w:tcMar>
+              <w:top w:w="100.0" w:type="dxa"/>
+              <w:left w:w="100.0" w:type="dxa"/>
+              <w:bottom w:w="100.0" w:type="dxa"/>
+              <w:right w:w="100.0" w:type="dxa"/>
+            </w:tcMar>
+            <w:vAlign w:val="top"/>
+          </w:tcPr>
+          <w:p>
+            <w:pPr>
+              <w:shd w:fill="ffffff" w:val="clear"/>
+              <w:spacing w:after="240" w:before="340" w:line="360" w:lineRule="auto"/>
+              <w:ind w:left="0" w:firstLine="0"/>
+              <w:rPr>
+                <w:rFonts w:ascii="Times New Roman" w:cs="Times New Roman" w:eastAsia="Times New Roman" w:hAnsi="Times New Roman"/>
+                <w:color w:val="0f1115"/>
+                <w:sz w:val="28"/>
+                <w:szCs w:val="28"/>
+              </w:rPr>
+            </w:pPr>
+            <w:r>
+              <w:rPr>
+                <w:rFonts w:ascii="Times New Roman" w:cs="Times New Roman" w:eastAsia="Times New Roman" w:hAnsi="Times New Roman"/>
+                <w:color w:val="0f1115"/>
+                <w:sz w:val="28"/>
+                <w:szCs w:val="28"/>
+                <w:rtl w:val="0"/>
+              </w:rPr>
+              <w:t xml:space="preserve">04-12-2025</w:t>
+            </w:r>
+          </w:p>
+        </w:tc>
+        <w:tc>
+          <w:tcPr>
+            <w:tcBorders>
+              <w:top w:color="000000" w:space="0" w:sz="4" w:val="single"/>
+              <w:left w:color="000000" w:space="0" w:sz="4" w:val="single"/>
+              <w:bottom w:color="000000" w:space="0" w:sz="4" w:val="single"/>
+              <w:right w:color="000000" w:space="0" w:sz="4" w:val="single"/>
+            </w:tcBorders>
+            <w:tcMar>
+              <w:top w:w="100.0" w:type="dxa"/>
+              <w:left w:w="100.0" w:type="dxa"/>
+              <w:bottom w:w="100.0" w:type="dxa"/>
+              <w:right w:w="100.0" w:type="dxa"/>
+            </w:tcMar>
+            <w:vAlign w:val="top"/>
+          </w:tcPr>
+          <w:p>
+            <w:pPr>
+              <w:shd w:fill="ffffff" w:val="clear"/>
+              <w:spacing w:after="240" w:before="340" w:line="360" w:lineRule="auto"/>
+              <w:ind w:left="0" w:firstLine="0"/>
+              <w:rPr>
+                <w:rFonts w:ascii="Times New Roman" w:cs="Times New Roman" w:eastAsia="Times New Roman" w:hAnsi="Times New Roman"/>
+                <w:color w:val="0f1115"/>
+                <w:sz w:val="28"/>
+                <w:szCs w:val="28"/>
+              </w:rPr>
+            </w:pPr>
+            <w:r>
+              <w:rPr>
+                <w:rFonts w:ascii="Times New Roman" w:cs="Times New Roman" w:eastAsia="Times New Roman" w:hAnsi="Times New Roman"/>
+                <w:color w:val="0f1115"/>
+                <w:sz w:val="28"/>
+                <w:szCs w:val="28"/>
+                <w:rtl w:val="0"/>
+              </w:rPr>
+              <w:t xml:space="preserve">06-12-2025</w:t>
+            </w:r>
+          </w:p>
+        </w:tc>
+      </w:tr>
+      <w:tr>
+        <w:trPr>
+          <w:cantSplit w:val="0"/>
+          <w:trHeight w:val="1125.9179687499998" w:hRule="atLeast"/>
+          <w:tblHeader w:val="0"/>
+        </w:trPr>
+        <w:tc>
+          <w:tcPr>
+            <w:tcBorders>
+              <w:top w:color="000000" w:space="0" w:sz="4" w:val="single"/>
+              <w:left w:color="000000" w:space="0" w:sz="4" w:val="single"/>
+              <w:bottom w:color="000000" w:space="0" w:sz="4" w:val="single"/>
+              <w:right w:color="000000" w:space="0" w:sz="4" w:val="single"/>
+            </w:tcBorders>
+            <w:tcMar>
+              <w:top w:w="100.0" w:type="dxa"/>
+              <w:left w:w="100.0" w:type="dxa"/>
+              <w:bottom w:w="100.0" w:type="dxa"/>
+              <w:right w:w="100.0" w:type="dxa"/>
+            </w:tcMar>
+            <w:vAlign w:val="top"/>
+          </w:tcPr>
+          <w:p>
+            <w:pPr>
+              <w:shd w:fill="ffffff" w:val="clear"/>
+              <w:spacing w:after="240" w:before="340" w:line="360" w:lineRule="auto"/>
+              <w:ind w:left="0" w:firstLine="0"/>
+              <w:rPr>
+                <w:rFonts w:ascii="Times New Roman" w:cs="Times New Roman" w:eastAsia="Times New Roman" w:hAnsi="Times New Roman"/>
+                <w:color w:val="0f1115"/>
+                <w:sz w:val="28"/>
+                <w:szCs w:val="28"/>
+              </w:rPr>
+            </w:pPr>
+            <w:r>
+              <w:rPr>
+                <w:rFonts w:ascii="Times New Roman" w:cs="Times New Roman" w:eastAsia="Times New Roman" w:hAnsi="Times New Roman"/>
+                <w:color w:val="0f1115"/>
+                <w:sz w:val="28"/>
+                <w:szCs w:val="28"/>
+                <w:rtl w:val="0"/>
+              </w:rPr>
+              <w:t xml:space="preserve">Test case documentation</w:t>
+            </w:r>
+          </w:p>
+        </w:tc>
+        <w:tc>
+          <w:tcPr>
+            <w:tcBorders>
+              <w:top w:color="000000" w:space="0" w:sz="4" w:val="single"/>
+              <w:left w:color="000000" w:space="0" w:sz="4" w:val="single"/>
+              <w:bottom w:color="000000" w:space="0" w:sz="4" w:val="single"/>
+              <w:right w:color="000000" w:space="0" w:sz="4" w:val="single"/>
+            </w:tcBorders>
+            <w:tcMar>
+              <w:top w:w="100.0" w:type="dxa"/>
+              <w:left w:w="100.0" w:type="dxa"/>
+              <w:bottom w:w="100.0" w:type="dxa"/>
+              <w:right w:w="100.0" w:type="dxa"/>
+            </w:tcMar>
+            <w:vAlign w:val="top"/>
+          </w:tcPr>
+          <w:p>
+            <w:pPr>
+              <w:shd w:fill="ffffff" w:val="clear"/>
+              <w:spacing w:after="240" w:before="340" w:line="360" w:lineRule="auto"/>
+              <w:ind w:left="0" w:firstLine="0"/>
+              <w:jc w:val="center"/>
+              <w:rPr>
+                <w:rFonts w:ascii="Times New Roman" w:cs="Times New Roman" w:eastAsia="Times New Roman" w:hAnsi="Times New Roman"/>
+                <w:color w:val="0f1115"/>
+                <w:sz w:val="28"/>
+                <w:szCs w:val="28"/>
+              </w:rPr>
+            </w:pPr>
+            <w:r>
+              <w:rPr>
+                <w:rFonts w:ascii="Times New Roman" w:cs="Times New Roman" w:eastAsia="Times New Roman" w:hAnsi="Times New Roman"/>
+                <w:color w:val="0f1115"/>
+                <w:sz w:val="28"/>
+                <w:szCs w:val="28"/>
+                <w:rtl w:val="0"/>
+              </w:rPr>
+              <w:t xml:space="preserve">8</w:t>
+            </w:r>
+          </w:p>
+        </w:tc>
+        <w:tc>
+          <w:tcPr>
+            <w:tcBorders>
+              <w:top w:color="000000" w:space="0" w:sz="4" w:val="single"/>
+              <w:left w:color="000000" w:space="0" w:sz="4" w:val="single"/>
+              <w:bottom w:color="000000" w:space="0" w:sz="4" w:val="single"/>
+              <w:right w:color="000000" w:space="0" w:sz="4" w:val="single"/>
+            </w:tcBorders>
+            <w:tcMar>
+              <w:top w:w="100.0" w:type="dxa"/>
+              <w:left w:w="100.0" w:type="dxa"/>
+              <w:bottom w:w="100.0" w:type="dxa"/>
+              <w:right w:w="100.0" w:type="dxa"/>
+            </w:tcMar>
+            <w:vAlign w:val="top"/>
+          </w:tcPr>
+          <w:p>
+            <w:pPr>
+              <w:shd w:fill="ffffff" w:val="clear"/>
+              <w:spacing w:after="240" w:before="340" w:line="360" w:lineRule="auto"/>
+              <w:ind w:left="0" w:firstLine="0"/>
+              <w:rPr>
+                <w:rFonts w:ascii="Times New Roman" w:cs="Times New Roman" w:eastAsia="Times New Roman" w:hAnsi="Times New Roman"/>
+                <w:color w:val="0f1115"/>
+                <w:sz w:val="28"/>
+                <w:szCs w:val="28"/>
+              </w:rPr>
+            </w:pPr>
+            <w:r>
+              <w:rPr>
+                <w:rFonts w:ascii="Times New Roman" w:cs="Times New Roman" w:eastAsia="Times New Roman" w:hAnsi="Times New Roman"/>
+                <w:color w:val="0f1115"/>
+                <w:sz w:val="28"/>
+                <w:szCs w:val="28"/>
+                <w:rtl w:val="0"/>
+              </w:rPr>
+              <w:t xml:space="preserve">07-12-2025</w:t>
+            </w:r>
+          </w:p>
+        </w:tc>
+        <w:tc>
+          <w:tcPr>
+            <w:tcBorders>
+              <w:top w:color="000000" w:space="0" w:sz="4" w:val="single"/>
+              <w:left w:color="000000" w:space="0" w:sz="4" w:val="single"/>
+              <w:bottom w:color="000000" w:space="0" w:sz="4" w:val="single"/>
+              <w:right w:color="000000" w:space="0" w:sz="4" w:val="single"/>
+            </w:tcBorders>
+            <w:tcMar>
+              <w:top w:w="100.0" w:type="dxa"/>
+              <w:left w:w="100.0" w:type="dxa"/>
+              <w:bottom w:w="100.0" w:type="dxa"/>
+              <w:right w:w="100.0" w:type="dxa"/>
+            </w:tcMar>
+            <w:vAlign w:val="top"/>
+          </w:tcPr>
+          <w:p>
+            <w:pPr>
+              <w:shd w:fill="ffffff" w:val="clear"/>
+              <w:spacing w:after="240" w:before="340" w:line="360" w:lineRule="auto"/>
+              <w:ind w:left="0" w:firstLine="0"/>
+              <w:rPr>
+                <w:rFonts w:ascii="Times New Roman" w:cs="Times New Roman" w:eastAsia="Times New Roman" w:hAnsi="Times New Roman"/>
+                <w:color w:val="0f1115"/>
+                <w:sz w:val="28"/>
+                <w:szCs w:val="28"/>
+              </w:rPr>
+            </w:pPr>
+            <w:r>
+              <w:rPr>
+                <w:rFonts w:ascii="Times New Roman" w:cs="Times New Roman" w:eastAsia="Times New Roman" w:hAnsi="Times New Roman"/>
+                <w:color w:val="0f1115"/>
+                <w:sz w:val="28"/>
+                <w:szCs w:val="28"/>
+                <w:rtl w:val="0"/>
+              </w:rPr>
+              <w:t xml:space="preserve">15-12-2025</w:t>
+            </w:r>
+          </w:p>
+        </w:tc>
+      </w:tr>
+      <w:tr>
+        <w:trPr>
+          <w:cantSplit w:val="0"/>
+          <w:trHeight w:val="1185.9179687499998" w:hRule="atLeast"/>
+          <w:tblHeader w:val="0"/>
+        </w:trPr>
+        <w:tc>
+          <w:tcPr>
+            <w:tcBorders>
+              <w:top w:color="000000" w:space="0" w:sz="4" w:val="single"/>
+              <w:left w:color="000000" w:space="0" w:sz="4" w:val="single"/>
+              <w:bottom w:color="000000" w:space="0" w:sz="4" w:val="single"/>
+              <w:right w:color="000000" w:space="0" w:sz="4" w:val="single"/>
+            </w:tcBorders>
+            <w:tcMar>
+              <w:top w:w="100.0" w:type="dxa"/>
+              <w:left w:w="100.0" w:type="dxa"/>
+              <w:bottom w:w="100.0" w:type="dxa"/>
+              <w:right w:w="100.0" w:type="dxa"/>
+            </w:tcMar>
+            <w:vAlign w:val="top"/>
+          </w:tcPr>
+          <w:p>
+            <w:pPr>
+              <w:shd w:fill="ffffff" w:val="clear"/>
+              <w:spacing w:after="240" w:before="340" w:line="360" w:lineRule="auto"/>
+              <w:ind w:left="0" w:firstLine="0"/>
+              <w:rPr>
+                <w:rFonts w:ascii="Times New Roman" w:cs="Times New Roman" w:eastAsia="Times New Roman" w:hAnsi="Times New Roman"/>
+                <w:color w:val="0f1115"/>
+                <w:sz w:val="28"/>
+                <w:szCs w:val="28"/>
+              </w:rPr>
+            </w:pPr>
+            <w:r>
+              <w:rPr>
+                <w:rFonts w:ascii="Times New Roman" w:cs="Times New Roman" w:eastAsia="Times New Roman" w:hAnsi="Times New Roman"/>
+                <w:color w:val="0f1115"/>
+                <w:sz w:val="28"/>
+                <w:szCs w:val="28"/>
+                <w:rtl w:val="0"/>
+              </w:rPr>
+              <w:t xml:space="preserve">Automation scripts</w:t>
+            </w:r>
+          </w:p>
+        </w:tc>
+        <w:tc>
+          <w:tcPr>
+            <w:tcBorders>
+              <w:top w:color="000000" w:space="0" w:sz="4" w:val="single"/>
+              <w:left w:color="000000" w:space="0" w:sz="4" w:val="single"/>
+              <w:bottom w:color="000000" w:space="0" w:sz="4" w:val="single"/>
+              <w:right w:color="000000" w:space="0" w:sz="4" w:val="single"/>
+            </w:tcBorders>
+            <w:tcMar>
+              <w:top w:w="100.0" w:type="dxa"/>
+              <w:left w:w="100.0" w:type="dxa"/>
+              <w:bottom w:w="100.0" w:type="dxa"/>
+              <w:right w:w="100.0" w:type="dxa"/>
+            </w:tcMar>
+            <w:vAlign w:val="top"/>
+          </w:tcPr>
+          <w:p>
+            <w:pPr>
+              <w:shd w:fill="ffffff" w:val="clear"/>
+              <w:spacing w:after="240" w:before="340" w:line="360" w:lineRule="auto"/>
+              <w:ind w:left="0" w:firstLine="0"/>
+              <w:jc w:val="center"/>
+              <w:rPr>
+                <w:rFonts w:ascii="Times New Roman" w:cs="Times New Roman" w:eastAsia="Times New Roman" w:hAnsi="Times New Roman"/>
+                <w:color w:val="0f1115"/>
+                <w:sz w:val="28"/>
+                <w:szCs w:val="28"/>
+              </w:rPr>
+            </w:pPr>
+            <w:r>
+              <w:rPr>
+                <w:rFonts w:ascii="Times New Roman" w:cs="Times New Roman" w:eastAsia="Times New Roman" w:hAnsi="Times New Roman"/>
+                <w:color w:val="0f1115"/>
+                <w:sz w:val="28"/>
+                <w:szCs w:val="28"/>
+                <w:rtl w:val="0"/>
+              </w:rPr>
+              <w:t xml:space="preserve">12</w:t>
+            </w:r>
+          </w:p>
+        </w:tc>
+        <w:tc>
+          <w:tcPr>
+            <w:tcBorders>
+              <w:top w:color="000000" w:space="0" w:sz="4" w:val="single"/>
+              <w:left w:color="000000" w:space="0" w:sz="4" w:val="single"/>
+              <w:bottom w:color="000000" w:space="0" w:sz="4" w:val="single"/>
+              <w:right w:color="000000" w:space="0" w:sz="4" w:val="single"/>
+            </w:tcBorders>
+            <w:tcMar>
+              <w:top w:w="100.0" w:type="dxa"/>
+              <w:left w:w="100.0" w:type="dxa"/>
+              <w:bottom w:w="100.0" w:type="dxa"/>
+              <w:right w:w="100.0" w:type="dxa"/>
+            </w:tcMar>
+            <w:vAlign w:val="top"/>
+          </w:tcPr>
+          <w:p>
+            <w:pPr>
+              <w:shd w:fill="ffffff" w:val="clear"/>
+              <w:spacing w:after="240" w:before="340" w:line="360" w:lineRule="auto"/>
+              <w:ind w:left="0" w:firstLine="0"/>
+              <w:rPr>
+                <w:rFonts w:ascii="Times New Roman" w:cs="Times New Roman" w:eastAsia="Times New Roman" w:hAnsi="Times New Roman"/>
+                <w:color w:val="0f1115"/>
+                <w:sz w:val="28"/>
+                <w:szCs w:val="28"/>
+              </w:rPr>
+            </w:pPr>
+            <w:r>
+              <w:rPr>
+                <w:rFonts w:ascii="Times New Roman" w:cs="Times New Roman" w:eastAsia="Times New Roman" w:hAnsi="Times New Roman"/>
+                <w:color w:val="0f1115"/>
+                <w:sz w:val="28"/>
+                <w:szCs w:val="28"/>
+                <w:rtl w:val="0"/>
+              </w:rPr>
+              <w:t xml:space="preserve">16-12-2025</w:t>
+            </w:r>
+          </w:p>
+        </w:tc>
+        <w:tc>
+          <w:tcPr>
+            <w:tcBorders>
+              <w:top w:color="000000" w:space="0" w:sz="4" w:val="single"/>
+              <w:left w:color="000000" w:space="0" w:sz="4" w:val="single"/>
+              <w:bottom w:color="000000" w:space="0" w:sz="4" w:val="single"/>
+              <w:right w:color="000000" w:space="0" w:sz="4" w:val="single"/>
+            </w:tcBorders>
+            <w:tcMar>
+              <w:top w:w="100.0" w:type="dxa"/>
+              <w:left w:w="100.0" w:type="dxa"/>
+              <w:bottom w:w="100.0" w:type="dxa"/>
+              <w:right w:w="100.0" w:type="dxa"/>
+            </w:tcMar>
+            <w:vAlign w:val="top"/>
+          </w:tcPr>
+          <w:p>
+            <w:pPr>
+              <w:shd w:fill="ffffff" w:val="clear"/>
+              <w:spacing w:after="240" w:before="340" w:line="360" w:lineRule="auto"/>
+              <w:ind w:left="0" w:firstLine="0"/>
+              <w:rPr>
+                <w:rFonts w:ascii="Times New Roman" w:cs="Times New Roman" w:eastAsia="Times New Roman" w:hAnsi="Times New Roman"/>
+                <w:color w:val="0f1115"/>
+                <w:sz w:val="28"/>
+                <w:szCs w:val="28"/>
+              </w:rPr>
+            </w:pPr>
+            <w:r>
+              <w:rPr>
+                <w:rFonts w:ascii="Times New Roman" w:cs="Times New Roman" w:eastAsia="Times New Roman" w:hAnsi="Times New Roman"/>
+                <w:color w:val="0f1115"/>
+                <w:sz w:val="28"/>
+                <w:szCs w:val="28"/>
+                <w:rtl w:val="0"/>
+              </w:rPr>
+              <w:t xml:space="preserve">30-12-2025</w:t>
+            </w:r>
+          </w:p>
+        </w:tc>
+      </w:tr>
+      <w:tr>
+        <w:trPr>
+          <w:cantSplit w:val="0"/>
+          <w:trHeight w:val="785" w:hRule="atLeast"/>
+          <w:tblHeader w:val="0"/>
+        </w:trPr>
+        <w:tc>
+          <w:tcPr>
+            <w:tcBorders>
+              <w:top w:color="000000" w:space="0" w:sz="4" w:val="single"/>
+              <w:left w:color="000000" w:space="0" w:sz="4" w:val="single"/>
+              <w:bottom w:color="000000" w:space="0" w:sz="4" w:val="single"/>
+              <w:right w:color="000000" w:space="0" w:sz="4" w:val="single"/>
+            </w:tcBorders>
+            <w:tcMar>
+              <w:top w:w="100.0" w:type="dxa"/>
+              <w:left w:w="100.0" w:type="dxa"/>
+              <w:bottom w:w="100.0" w:type="dxa"/>
+              <w:right w:w="100.0" w:type="dxa"/>
+            </w:tcMar>
+            <w:vAlign w:val="top"/>
+          </w:tcPr>
+          <w:p>
+            <w:pPr>
+              <w:shd w:fill="ffffff" w:val="clear"/>
+              <w:spacing w:after="240" w:before="340" w:line="360" w:lineRule="auto"/>
+              <w:ind w:left="0" w:firstLine="0"/>
+              <w:rPr>
+                <w:rFonts w:ascii="Times New Roman" w:cs="Times New Roman" w:eastAsia="Times New Roman" w:hAnsi="Times New Roman"/>
+                <w:color w:val="0f1115"/>
+                <w:sz w:val="28"/>
+                <w:szCs w:val="28"/>
+              </w:rPr>
+            </w:pPr>
+            <w:r>
+              <w:rPr>
+                <w:rFonts w:ascii="Times New Roman" w:cs="Times New Roman" w:eastAsia="Times New Roman" w:hAnsi="Times New Roman"/>
+                <w:color w:val="0f1115"/>
+                <w:sz w:val="28"/>
+                <w:szCs w:val="28"/>
+                <w:rtl w:val="0"/>
+              </w:rPr>
+              <w:t xml:space="preserve">Defect Report</w:t>
+            </w:r>
+          </w:p>
+        </w:tc>
+        <w:tc>
+          <w:tcPr>
+            <w:tcBorders>
+              <w:top w:color="000000" w:space="0" w:sz="4" w:val="single"/>
+              <w:left w:color="000000" w:space="0" w:sz="4" w:val="single"/>
+              <w:bottom w:color="000000" w:space="0" w:sz="4" w:val="single"/>
+              <w:right w:color="000000" w:space="0" w:sz="4" w:val="single"/>
+            </w:tcBorders>
+            <w:tcMar>
+              <w:top w:w="100.0" w:type="dxa"/>
+              <w:left w:w="100.0" w:type="dxa"/>
+              <w:bottom w:w="100.0" w:type="dxa"/>
+              <w:right w:w="100.0" w:type="dxa"/>
+            </w:tcMar>
+            <w:vAlign w:val="top"/>
+          </w:tcPr>
+          <w:p>
+            <w:pPr>
+              <w:shd w:fill="ffffff" w:val="clear"/>
+              <w:spacing w:after="240" w:before="340" w:line="360" w:lineRule="auto"/>
+              <w:ind w:left="0" w:firstLine="0"/>
+              <w:jc w:val="center"/>
+              <w:rPr>
+                <w:rFonts w:ascii="Times New Roman" w:cs="Times New Roman" w:eastAsia="Times New Roman" w:hAnsi="Times New Roman"/>
+                <w:color w:val="0f1115"/>
+                <w:sz w:val="28"/>
+                <w:szCs w:val="28"/>
+              </w:rPr>
+            </w:pPr>
+            <w:r>
+              <w:rPr>
+                <w:rFonts w:ascii="Times New Roman" w:cs="Times New Roman" w:eastAsia="Times New Roman" w:hAnsi="Times New Roman"/>
+                <w:color w:val="0f1115"/>
+                <w:sz w:val="28"/>
+                <w:szCs w:val="28"/>
+                <w:rtl w:val="0"/>
+              </w:rPr>
+              <w:t xml:space="preserve">2</w:t>
+            </w:r>
+          </w:p>
+        </w:tc>
+        <w:tc>
+          <w:tcPr>
+            <w:tcBorders>
+              <w:top w:color="000000" w:space="0" w:sz="4" w:val="single"/>
+              <w:left w:color="000000" w:space="0" w:sz="4" w:val="single"/>
+              <w:bottom w:color="000000" w:space="0" w:sz="4" w:val="single"/>
+              <w:right w:color="000000" w:space="0" w:sz="4" w:val="single"/>
+            </w:tcBorders>
+            <w:tcMar>
+              <w:top w:w="100.0" w:type="dxa"/>
+              <w:left w:w="100.0" w:type="dxa"/>
+              <w:bottom w:w="100.0" w:type="dxa"/>
+              <w:right w:w="100.0" w:type="dxa"/>
+            </w:tcMar>
+            <w:vAlign w:val="top"/>
+          </w:tcPr>
+          <w:p>
+            <w:pPr>
+              <w:shd w:fill="ffffff" w:val="clear"/>
+              <w:spacing w:after="240" w:before="340" w:line="360" w:lineRule="auto"/>
+              <w:ind w:left="0" w:firstLine="0"/>
+              <w:rPr>
+                <w:rFonts w:ascii="Times New Roman" w:cs="Times New Roman" w:eastAsia="Times New Roman" w:hAnsi="Times New Roman"/>
+                <w:color w:val="0f1115"/>
+                <w:sz w:val="28"/>
+                <w:szCs w:val="28"/>
+              </w:rPr>
+            </w:pPr>
+            <w:r>
+              <w:rPr>
+                <w:rFonts w:ascii="Times New Roman" w:cs="Times New Roman" w:eastAsia="Times New Roman" w:hAnsi="Times New Roman"/>
+                <w:color w:val="0f1115"/>
+                <w:sz w:val="28"/>
+                <w:szCs w:val="28"/>
+                <w:rtl w:val="0"/>
+              </w:rPr>
+              <w:t xml:space="preserve">31-12-2025</w:t>
+            </w:r>
+          </w:p>
+        </w:tc>
+        <w:tc>
+          <w:tcPr>
+            <w:tcBorders>
+              <w:top w:color="000000" w:space="0" w:sz="4" w:val="single"/>
+              <w:left w:color="000000" w:space="0" w:sz="4" w:val="single"/>
+              <w:bottom w:color="000000" w:space="0" w:sz="4" w:val="single"/>
+              <w:right w:color="000000" w:space="0" w:sz="4" w:val="single"/>
+            </w:tcBorders>
+            <w:tcMar>
+              <w:top w:w="100.0" w:type="dxa"/>
+              <w:left w:w="100.0" w:type="dxa"/>
+              <w:bottom w:w="100.0" w:type="dxa"/>
+              <w:right w:w="100.0" w:type="dxa"/>
+            </w:tcMar>
+            <w:vAlign w:val="top"/>
+          </w:tcPr>
+          <w:p>
+            <w:pPr>
+              <w:shd w:fill="ffffff" w:val="clear"/>
+              <w:spacing w:after="240" w:before="340" w:line="360" w:lineRule="auto"/>
+              <w:ind w:left="0" w:firstLine="0"/>
+              <w:rPr>
+                <w:rFonts w:ascii="Times New Roman" w:cs="Times New Roman" w:eastAsia="Times New Roman" w:hAnsi="Times New Roman"/>
+                <w:color w:val="0f1115"/>
+                <w:sz w:val="28"/>
+                <w:szCs w:val="28"/>
+              </w:rPr>
+            </w:pPr>
+            <w:r>
+              <w:rPr>
+                <w:rFonts w:ascii="Times New Roman" w:cs="Times New Roman" w:eastAsia="Times New Roman" w:hAnsi="Times New Roman"/>
+                <w:color w:val="0f1115"/>
+                <w:sz w:val="28"/>
+                <w:szCs w:val="28"/>
+                <w:rtl w:val="0"/>
+              </w:rPr>
+              <w:t xml:space="preserve">02-01-2026</w:t>
+            </w:r>
+          </w:p>
+        </w:tc>
+      </w:tr>
+      <w:tr>
+        <w:trPr>
+          <w:cantSplit w:val="0"/>
+          <w:trHeight w:val="785" w:hRule="atLeast"/>
+          <w:tblHeader w:val="0"/>
+        </w:trPr>
+        <w:tc>
+          <w:tcPr>
+            <w:tcBorders>
+              <w:top w:color="000000" w:space="0" w:sz="4" w:val="single"/>
+              <w:left w:color="000000" w:space="0" w:sz="4" w:val="single"/>
+              <w:bottom w:color="000000" w:space="0" w:sz="4" w:val="single"/>
+              <w:right w:color="000000" w:space="0" w:sz="4" w:val="single"/>
+            </w:tcBorders>
+            <w:tcMar>
+              <w:top w:w="100.0" w:type="dxa"/>
+              <w:left w:w="100.0" w:type="dxa"/>
+              <w:bottom w:w="100.0" w:type="dxa"/>
+              <w:right w:w="100.0" w:type="dxa"/>
+            </w:tcMar>
+            <w:vAlign w:val="top"/>
+          </w:tcPr>
+          <w:p>
+            <w:pPr>
+              <w:shd w:fill="ffffff" w:val="clear"/>
+              <w:spacing w:after="240" w:before="340" w:line="360" w:lineRule="auto"/>
+              <w:ind w:left="0" w:firstLine="0"/>
+              <w:rPr>
+                <w:rFonts w:ascii="Times New Roman" w:cs="Times New Roman" w:eastAsia="Times New Roman" w:hAnsi="Times New Roman"/>
+                <w:color w:val="0f1115"/>
+                <w:sz w:val="28"/>
+                <w:szCs w:val="28"/>
+              </w:rPr>
+            </w:pPr>
+            <w:r>
+              <w:rPr>
+                <w:rFonts w:ascii="Times New Roman" w:cs="Times New Roman" w:eastAsia="Times New Roman" w:hAnsi="Times New Roman"/>
+                <w:color w:val="0f1115"/>
+                <w:sz w:val="28"/>
+                <w:szCs w:val="28"/>
+                <w:rtl w:val="0"/>
+              </w:rPr>
+              <w:t xml:space="preserve">Test Closure</w:t>
+            </w:r>
+          </w:p>
+        </w:tc>
+        <w:tc>
+          <w:tcPr>
+            <w:tcBorders>
+              <w:top w:color="000000" w:space="0" w:sz="4" w:val="single"/>
+              <w:left w:color="000000" w:space="0" w:sz="4" w:val="single"/>
+              <w:bottom w:color="000000" w:space="0" w:sz="4" w:val="single"/>
+              <w:right w:color="000000" w:space="0" w:sz="4" w:val="single"/>
+            </w:tcBorders>
+            <w:tcMar>
+              <w:top w:w="100.0" w:type="dxa"/>
+              <w:left w:w="100.0" w:type="dxa"/>
+              <w:bottom w:w="100.0" w:type="dxa"/>
+              <w:right w:w="100.0" w:type="dxa"/>
+            </w:tcMar>
+            <w:vAlign w:val="top"/>
+          </w:tcPr>
+          <w:p>
+            <w:pPr>
+              <w:shd w:fill="ffffff" w:val="clear"/>
+              <w:spacing w:after="240" w:before="340" w:line="360" w:lineRule="auto"/>
+              <w:ind w:left="0" w:firstLine="0"/>
+              <w:jc w:val="center"/>
+              <w:rPr>
+                <w:rFonts w:ascii="Times New Roman" w:cs="Times New Roman" w:eastAsia="Times New Roman" w:hAnsi="Times New Roman"/>
+                <w:color w:val="0f1115"/>
+                <w:sz w:val="28"/>
+                <w:szCs w:val="28"/>
+              </w:rPr>
+            </w:pPr>
+            <w:r>
+              <w:rPr>
+                <w:rFonts w:ascii="Times New Roman" w:cs="Times New Roman" w:eastAsia="Times New Roman" w:hAnsi="Times New Roman"/>
+                <w:color w:val="0f1115"/>
+                <w:sz w:val="28"/>
+                <w:szCs w:val="28"/>
+                <w:rtl w:val="0"/>
+              </w:rPr>
+              <w:t xml:space="preserve">4</w:t>
+            </w:r>
+          </w:p>
+        </w:tc>
+        <w:tc>
+          <w:tcPr>
+            <w:tcBorders>
+              <w:top w:color="000000" w:space="0" w:sz="4" w:val="single"/>
+              <w:left w:color="000000" w:space="0" w:sz="4" w:val="single"/>
+              <w:bottom w:color="000000" w:space="0" w:sz="4" w:val="single"/>
+              <w:right w:color="000000" w:space="0" w:sz="4" w:val="single"/>
+            </w:tcBorders>
+            <w:tcMar>
+              <w:top w:w="100.0" w:type="dxa"/>
+              <w:left w:w="100.0" w:type="dxa"/>
+              <w:bottom w:w="100.0" w:type="dxa"/>
+              <w:right w:w="100.0" w:type="dxa"/>
+            </w:tcMar>
+            <w:vAlign w:val="top"/>
+          </w:tcPr>
+          <w:p>
+            <w:pPr>
+              <w:shd w:fill="ffffff" w:val="clear"/>
+              <w:spacing w:after="240" w:before="340" w:line="360" w:lineRule="auto"/>
+              <w:ind w:left="0" w:firstLine="0"/>
+              <w:rPr>
+                <w:rFonts w:ascii="Times New Roman" w:cs="Times New Roman" w:eastAsia="Times New Roman" w:hAnsi="Times New Roman"/>
+                <w:color w:val="0f1115"/>
+                <w:sz w:val="28"/>
+                <w:szCs w:val="28"/>
+              </w:rPr>
+            </w:pPr>
+            <w:r>
+              <w:rPr>
+                <w:rFonts w:ascii="Times New Roman" w:cs="Times New Roman" w:eastAsia="Times New Roman" w:hAnsi="Times New Roman"/>
+                <w:color w:val="0f1115"/>
+                <w:sz w:val="28"/>
+                <w:szCs w:val="28"/>
+                <w:rtl w:val="0"/>
+              </w:rPr>
+              <w:t xml:space="preserve">03-01-2026</w:t>
+            </w:r>
+          </w:p>
+        </w:tc>
+        <w:tc>
+          <w:tcPr>
+            <w:tcBorders>
+              <w:top w:color="000000" w:space="0" w:sz="4" w:val="single"/>
+              <w:left w:color="000000" w:space="0" w:sz="4" w:val="single"/>
+              <w:bottom w:color="000000" w:space="0" w:sz="4" w:val="single"/>
+              <w:right w:color="000000" w:space="0" w:sz="4" w:val="single"/>
+            </w:tcBorders>
+            <w:tcMar>
+              <w:top w:w="100.0" w:type="dxa"/>
+              <w:left w:w="100.0" w:type="dxa"/>
+              <w:bottom w:w="100.0" w:type="dxa"/>
+              <w:right w:w="100.0" w:type="dxa"/>
+            </w:tcMar>
+            <w:vAlign w:val="top"/>
+          </w:tcPr>
+          <w:p>
+            <w:pPr>
+              <w:shd w:fill="ffffff" w:val="clear"/>
+              <w:spacing w:after="240" w:before="340" w:line="360" w:lineRule="auto"/>
+              <w:ind w:left="0" w:firstLine="0"/>
+              <w:rPr>
+                <w:rFonts w:ascii="Times New Roman" w:cs="Times New Roman" w:eastAsia="Times New Roman" w:hAnsi="Times New Roman"/>
+                <w:color w:val="0f1115"/>
+                <w:sz w:val="28"/>
+                <w:szCs w:val="28"/>
+              </w:rPr>
+            </w:pPr>
+            <w:r>
+              <w:rPr>
+                <w:rFonts w:ascii="Times New Roman" w:cs="Times New Roman" w:eastAsia="Times New Roman" w:hAnsi="Times New Roman"/>
+                <w:color w:val="0f1115"/>
+                <w:sz w:val="28"/>
+                <w:szCs w:val="28"/>
+                <w:rtl w:val="0"/>
+              </w:rPr>
+              <w:t xml:space="preserve">06-01-2026</w:t>
+            </w:r>
+          </w:p>
+        </w:tc>
+      </w:tr>
+    </w:tbl>
     <w:p>
       <w:pPr>
         <w:shd w:fill="ffffff" w:val="clear"/>
@@ -3145,6 +4353,55 @@
       </w:pPr>
       <w:r>
         <w:rPr>
+          <w:rtl w:val="0"/>
+        </w:rPr>
+      </w:r>
+    </w:p>
+    <w:p>
+      <w:pPr>
+        <w:numPr>
+          <w:ilvl w:val="0"/>
+          <w:numId w:val="1"/>
+        </w:numPr>
+        <w:shd w:fill="ffffff" w:val="clear"/>
+        <w:spacing w:after="240" w:before="340" w:line="360" w:lineRule="auto"/>
+        <w:ind w:left="720" w:hanging="360"/>
+        <w:rPr>
+          <w:rFonts w:ascii="Times New Roman" w:cs="Times New Roman" w:eastAsia="Times New Roman" w:hAnsi="Times New Roman"/>
+          <w:b w:val="1"/>
+          <w:bCs w:val="1"/>
+          <w:color w:val="0f1115"/>
+          <w:sz w:val="28"/>
+          <w:szCs w:val="28"/>
+        </w:rPr>
+      </w:pPr>
+      <w:r>
+        <w:rPr>
+          <w:rFonts w:ascii="Times New Roman" w:cs="Times New Roman" w:eastAsia="Times New Roman" w:hAnsi="Times New Roman"/>
+          <w:b w:val="1"/>
+          <w:bCs w:val="1"/>
+          <w:color w:val="0f1115"/>
+          <w:sz w:val="32"/>
+          <w:szCs w:val="32"/>
+          <w:rtl w:val="0"/>
+        </w:rPr>
+        <w:t xml:space="preserve"> Conclusion</w:t>
+      </w:r>
+    </w:p>
+    <w:p>
+      <w:pPr>
+        <w:shd w:fill="ffffff" w:val="clear"/>
+        <w:spacing w:after="240" w:before="340" w:line="360" w:lineRule="auto"/>
+        <w:ind w:left="720" w:firstLine="0"/>
+        <w:rPr>
+          <w:rFonts w:ascii="Times New Roman" w:cs="Times New Roman" w:eastAsia="Times New Roman" w:hAnsi="Times New Roman"/>
+          <w:color w:val="0f1115"/>
+          <w:sz w:val="28"/>
+          <w:szCs w:val="28"/>
+        </w:rPr>
+      </w:pPr>
+      <w:r>
+        <w:rPr>
           <w:rFonts w:ascii="Times New Roman" w:cs="Times New Roman" w:eastAsia="Times New Roman" w:hAnsi="Times New Roman"/>
           <w:color w:val="0f1115"/>
           <w:sz w:val="28"/>
@@ -3164,7 +4421,118 @@
       <w:pPr>
         <w:shd w:fill="ffffff" w:val="clear"/>
         <w:spacing w:after="240" w:before="240" w:line="360" w:lineRule="auto"/>
-        <w:ind w:left="1440" w:firstLine="0"/>
+        <w:ind w:left="0" w:firstLine="0"/>
+        <w:rPr>
+          <w:rFonts w:ascii="Times New Roman" w:cs="Times New Roman" w:eastAsia="Times New Roman" w:hAnsi="Times New Roman"/>
+          <w:color w:val="0f1115"/>
+          <w:sz w:val="28"/>
+          <w:szCs w:val="28"/>
+        </w:rPr>
+      </w:pPr>
+      <w:hyperlink r:id="rId8">
+        <w:r>
+          <w:rPr>
+            <w:rFonts w:ascii="Times New Roman" w:cs="Times New Roman" w:eastAsia="Times New Roman" w:hAnsi="Times New Roman"/>
+            <w:color w:val="1155cc"/>
+            <w:sz w:val="28"/>
+            <w:szCs w:val="28"/>
+            <w:u w:val="single"/>
+            <w:rtl w:val="0"/>
+          </w:rPr>
+          <w:t xml:space="preserve">Feaature list</w:t>
+        </w:r>
+      </w:hyperlink>
+      <w:r>
+        <w:rPr>
+          <w:rtl w:val="0"/>
+        </w:rPr>
+      </w:r>
+    </w:p>
+    <w:p>
+      <w:pPr>
+        <w:shd w:fill="ffffff" w:val="clear"/>
+        <w:spacing w:after="240" w:before="240" w:line="360" w:lineRule="auto"/>
+        <w:ind w:left="0" w:firstLine="0"/>
+        <w:rPr>
+          <w:rFonts w:ascii="Times New Roman" w:cs="Times New Roman" w:eastAsia="Times New Roman" w:hAnsi="Times New Roman"/>
+          <w:color w:val="0f1115"/>
+          <w:sz w:val="28"/>
+          <w:szCs w:val="28"/>
+        </w:rPr>
+      </w:pPr>
+      <w:hyperlink r:id="rId9">
+        <w:r>
+          <w:rPr>
+            <w:rFonts w:ascii="Times New Roman" w:cs="Times New Roman" w:eastAsia="Times New Roman" w:hAnsi="Times New Roman"/>
+            <w:color w:val="1155cc"/>
+            <w:sz w:val="28"/>
+            <w:szCs w:val="28"/>
+            <w:u w:val="single"/>
+            <w:rtl w:val="0"/>
+          </w:rPr>
+          <w:t xml:space="preserve">Test case document</w:t>
+        </w:r>
+      </w:hyperlink>
+      <w:r>
+        <w:rPr>
+          <w:rtl w:val="0"/>
+        </w:rPr>
+      </w:r>
+    </w:p>
+    <w:p>
+      <w:pPr>
+        <w:shd w:fill="ffffff" w:val="clear"/>
+        <w:spacing w:after="240" w:before="240" w:line="360" w:lineRule="auto"/>
+        <w:ind w:left="0" w:firstLine="0"/>
+        <w:rPr>
+          <w:rFonts w:ascii="Times New Roman" w:cs="Times New Roman" w:eastAsia="Times New Roman" w:hAnsi="Times New Roman"/>
+          <w:color w:val="0f1115"/>
+          <w:sz w:val="28"/>
+          <w:szCs w:val="28"/>
+        </w:rPr>
+      </w:pPr>
+      <w:hyperlink r:id="rId10">
+        <w:r>
+          <w:rPr>
+            <w:rFonts w:ascii="Times New Roman" w:cs="Times New Roman" w:eastAsia="Times New Roman" w:hAnsi="Times New Roman"/>
+            <w:color w:val="1155cc"/>
+            <w:sz w:val="28"/>
+            <w:szCs w:val="28"/>
+            <w:u w:val="single"/>
+            <w:rtl w:val="0"/>
+          </w:rPr>
+          <w:t xml:space="preserve">Github</w:t>
+        </w:r>
+      </w:hyperlink>
+      <w:r>
+        <w:rPr>
+          <w:rtl w:val="0"/>
+        </w:rPr>
+      </w:r>
+    </w:p>
+    <w:p>
+      <w:pPr>
+        <w:shd w:fill="ffffff" w:val="clear"/>
+        <w:spacing w:after="240" w:before="240" w:line="360" w:lineRule="auto"/>
+        <w:ind w:left="0" w:firstLine="0"/>
+        <w:rPr>
+          <w:rFonts w:ascii="Times New Roman" w:cs="Times New Roman" w:eastAsia="Times New Roman" w:hAnsi="Times New Roman"/>
+          <w:color w:val="0f1115"/>
+          <w:sz w:val="28"/>
+          <w:szCs w:val="28"/>
+        </w:rPr>
+      </w:pPr>
+      <w:r>
+        <w:rPr>
+          <w:rtl w:val="0"/>
+        </w:rPr>
+      </w:r>
+    </w:p>
+    <w:p>
+      <w:pPr>
+        <w:shd w:fill="ffffff" w:val="clear"/>
+        <w:spacing w:after="240" w:before="240" w:line="360" w:lineRule="auto"/>
+        <w:ind w:left="0" w:firstLine="0"/>
         <w:rPr>
           <w:rFonts w:ascii="Times New Roman" w:cs="Times New Roman" w:eastAsia="Times New Roman" w:hAnsi="Times New Roman"/>
           <w:color w:val="0f1115"/>
@@ -3469,6 +4837,50 @@
       <w:sz w:val="30"/>
       <w:szCs w:val="30"/>
     </w:rPr>
+  </w:style>
+  <w:style w:type="table" w:styleId="Table1">
+    <w:basedOn w:val="TableNormal"/>
+    <w:tblPr>
+      <w:tblStyleRowBandSize w:val="1"/>
+      <w:tblStyleColBandSize w:val="1"/>
+      <w:tblCellMar/>
+    </w:tblPr>
+    <w:tblStylePr w:type="band1Horz">
+      <w:tcPr/>
+    </w:tblStylePr>
+    <w:tblStylePr w:type="band1Vert">
+      <w:tcPr/>
+    </w:tblStylePr>
+    <w:tblStylePr w:type="band2Horz">
+      <w:tcPr/>
+    </w:tblStylePr>
+    <w:tblStylePr w:type="band2Vert">
+      <w:tcPr/>
+    </w:tblStylePr>
+    <w:tblStylePr w:type="firstCol">
+      <w:tcPr/>
+    </w:tblStylePr>
+    <w:tblStylePr w:type="firstRow">
+      <w:tcPr/>
+    </w:tblStylePr>
+    <w:tblStylePr w:type="lastCol">
+      <w:tcPr/>
+    </w:tblStylePr>
+    <w:tblStylePr w:type="lastRow">
+      <w:tcPr/>
+    </w:tblStylePr>
+    <w:tblStylePr w:type="neCell">
+      <w:tcPr/>
+    </w:tblStylePr>
+    <w:tblStylePr w:type="nwCell">
+      <w:tcPr/>
+    </w:tblStylePr>
+    <w:tblStylePr w:type="seCell">
+      <w:tcPr/>
+    </w:tblStylePr>
+    <w:tblStylePr w:type="swCell">
+      <w:tcPr/>
+    </w:tblStylePr>
   </w:style>
 </w:styles>
 </file>

</xml_diff>

<commit_message>
Test summary report and defect reports uploaded
</commit_message>
<xml_diff>
--- a/Test Plan – AcademyBugs Website.docx
+++ b/Test Plan – AcademyBugs Website.docx
@@ -3141,7 +3141,7 @@
       <w:tr>
         <w:trPr>
           <w:cantSplit w:val="0"/>
-          <w:trHeight w:val="852.9589843749999" w:hRule="atLeast"/>
+          <w:trHeight w:val="927.9589843749999" w:hRule="atLeast"/>
           <w:tblHeader w:val="0"/>
         </w:trPr>
         <w:tc>
@@ -4439,7 +4439,7 @@
             <w:u w:val="single"/>
             <w:rtl w:val="0"/>
           </w:rPr>
-          <w:t xml:space="preserve">Feaature list</w:t>
+          <w:t xml:space="preserve">Feature list</w:t>
         </w:r>
       </w:hyperlink>
       <w:r>
@@ -4473,55 +4473,6 @@
           <w:t xml:space="preserve">Test case document</w:t>
         </w:r>
       </w:hyperlink>
-      <w:r>
-        <w:rPr>
-          <w:rtl w:val="0"/>
-        </w:rPr>
-      </w:r>
-    </w:p>
-    <w:p>
-      <w:pPr>
-        <w:shd w:fill="ffffff" w:val="clear"/>
-        <w:spacing w:after="240" w:before="240" w:line="360" w:lineRule="auto"/>
-        <w:ind w:left="0" w:firstLine="0"/>
-        <w:rPr>
-          <w:rFonts w:ascii="Times New Roman" w:cs="Times New Roman" w:eastAsia="Times New Roman" w:hAnsi="Times New Roman"/>
-          <w:color w:val="0f1115"/>
-          <w:sz w:val="28"/>
-          <w:szCs w:val="28"/>
-        </w:rPr>
-      </w:pPr>
-      <w:hyperlink r:id="rId10">
-        <w:r>
-          <w:rPr>
-            <w:rFonts w:ascii="Times New Roman" w:cs="Times New Roman" w:eastAsia="Times New Roman" w:hAnsi="Times New Roman"/>
-            <w:color w:val="1155cc"/>
-            <w:sz w:val="28"/>
-            <w:szCs w:val="28"/>
-            <w:u w:val="single"/>
-            <w:rtl w:val="0"/>
-          </w:rPr>
-          <w:t xml:space="preserve">Github</w:t>
-        </w:r>
-      </w:hyperlink>
-      <w:r>
-        <w:rPr>
-          <w:rtl w:val="0"/>
-        </w:rPr>
-      </w:r>
-    </w:p>
-    <w:p>
-      <w:pPr>
-        <w:shd w:fill="ffffff" w:val="clear"/>
-        <w:spacing w:after="240" w:before="240" w:line="360" w:lineRule="auto"/>
-        <w:ind w:left="0" w:firstLine="0"/>
-        <w:rPr>
-          <w:rFonts w:ascii="Times New Roman" w:cs="Times New Roman" w:eastAsia="Times New Roman" w:hAnsi="Times New Roman"/>
-          <w:color w:val="0f1115"/>
-          <w:sz w:val="28"/>
-          <w:szCs w:val="28"/>
-        </w:rPr>
-      </w:pPr>
       <w:r>
         <w:rPr>
           <w:rtl w:val="0"/>

</xml_diff>